<commit_message>
Complete the Flow Weight to Capacity replacement
Follow-up to 1c9dff8, which missed several current-facing uses. The handoff
asked for a global search and replacement of current-facing Flow Weight; this
sweeps infrastructure.md, classes.md and both manuscript formats.

Remaining occurrences are [HISTORICAL] markers explaining the supersession, the
source-register entry naming what was replaced, and the chronology line, all of
which are meant to retain the trace.

docs/reconciliation/* remains untouched as dated historical record.

Co-Authored-By: Claude Opus 5 <noreply@anthropic.com>
</commit_message>
<xml_diff>
--- a/docs/manuscript/Minecraft-MOBA-Design.docx
+++ b/docs/manuscript/Minecraft-MOBA-Design.docx
@@ -8036,7 +8036,7 @@
     </w:p>
     <w:p>
       <w:r>
-        <w:t xml:space="preserve">Working canon, reframed. Sources: [WB], [I], [WI], [C: Logistics], [O §20]. A Supply Line is persistent infrastructure produced by demonstrating repeatable resource delivery to an eligible destination. Its origin, path, Flow Weight, Item Rate, and other performance properties are derived from the logistical movement that establishes it rather than being specified beforehand.</w:t>
+        <w:t xml:space="preserve">Working canon, reframed. Sources: [WB], [I], [WI], [C: Logistics], [O §20]. A Supply Line is persistent infrastructure produced by demonstrating repeatable resource delivery to an eligible destination. Its origin, path, Capacity, Item Rate, and other performance properties are derived from the logistical movement that establishes it rather than being specified beforehand.</w:t>
       </w:r>
     </w:p>
     <w:p>
@@ -8079,12 +8079,12 @@
     </w:p>
     <w:p>
       <w:r>
-        <w:t xml:space="preserve">Transit Time measures elapsed delivery time for the demonstrated method; ordinary player transport has baseline Flow Weight 1. Flow Weight is an authored gameplay property of a logistical movement method, representing the standardized carrying capacity that method demonstrates. It determines how many items transfer per Supply Line pulse. It is not Item Rate, and it is not derived solely from literal Minecraft inventory slot count.</w:t>
-      </w:r>
-    </w:p>
-    <w:p>
-      <w:r>
-        <w:t xml:space="preserve">Item Rate is not an authored property of the carrier in isolation. It is derived from how quickly the actual demonstrated cargo movement reached its destination: observed successful Transit Time yields Item Rate, which sets pulse frequency. Flow Weight therefore determines items per pulse and Item Rate determines how frequently pulses occur, with effective throughput conceptually Flow Weight multiplied by Item Rate. Do not collapse these into a single generic throughput stat in the underlying design. [HISTORICAL] The earlier single Flow Rate proportional to Flow Weight divided by Transit Time is superseded by this pair.</w:t>
+        <w:t xml:space="preserve">Transit Time measures elapsed delivery time for the demonstrated method; ordinary player transport has [HISTORICAL] This paragraph's Flow Weight framing is superseded by Capacity (§6.23), measured in Minecraft inventory slots.</w:t>
+      </w:r>
+    </w:p>
+    <w:p>
+      <w:r>
+        <w:t xml:space="preserve">Item Rate is not an authored property of the carrier in isolation. It is derived from how quickly the actual demonstrated cargo movement reached its destination: observed successful Transit Time yields Item Rate, which sets pulse frequency. Capacity therefore determines cargo slots per delivery and Item Rate determines how frequently pulses occur, with effective throughput conceptually Capacity multiplied by Item Rate. Do not collapse these into a single generic throughput stat in the underlying design. [HISTORICAL] The earlier single Flow Rate proportional to Flow Weight divided by Transit Time is superseded by this pair.</w:t>
       </w:r>
     </w:p>
     <w:p>
@@ -8253,7 +8253,7 @@
     </w:p>
     <w:p>
       <w:r>
-        <w:t xml:space="preserve">[OPEN] Do not yet canonize a generic penalty such as automated methods always having reduced Flow Weight. Engineered systems naturally offer a predictable vector, repeatability, potentially low establishment attention, and infrastructure that may already physically encode the path. Living and guided systems may offer route flexibility, terrain adaptation, aerial traversal, class abilities, and potentially better demonstrated Item Rate or higher authored Flow Weight. An abstract compensatory penalty may be unnecessary if the profiles already differ enough. Compare actual candidate methods before introducing a universal modifier.</w:t>
+        <w:t xml:space="preserve">[OPEN] Do not yet canonize a generic penalty such as automated methods always having reduced Capacity. Engineered systems naturally offer a predictable vector, repeatability, potentially low establishment attention, and infrastructure that may already physically encode the path. Living and guided systems may offer route flexibility, terrain adaptation, aerial traversal, class abilities, and potentially better demonstrated Item Rate or higher Capacity. An abstract compensatory penalty may be unnecessary if the profiles already differ enough. Compare actual candidate methods before introducing a universal modifier.</w:t>
       </w:r>
     </w:p>
     <w:p>
@@ -9157,7 +9157,7 @@
     </w:p>
     <w:p>
       <w:r>
-        <w:t>A Supply Line is therefore **persistent infrastructure that simulates repeated resource deliveries by the logistical method that established a connection between two designated Copper Chests.** Its Flow Weight represents that method's carrying efficiency and capacity; its Item Rate represents the frequency with which that method can deliver across the established connection under its relevant movement conditions.</w:t>
+        <w:t xml:space="preserve">A Supply Line is therefore **persistent infrastructure that simulates repeated resource deliveries by the logistical method that established a connection between two designated Copper Chests.** Its Capacity is how much cargo that method moves in one delivery, measured in Minecraft inventory slots; its Item Rate represents the frequency with which that method can deliver across the established connection under its relevant movement conditions.</w:t>
       </w:r>
     </w:p>
     <w:p>
@@ -9185,7 +9185,7 @@
     </w:p>
     <w:p>
       <w:r>
-        <w:t>Resolved, late September 2026. Source: [WR]. Endpoints are sufficient to express player intent **for self-directed logistical methods**, which therefore need no player-authored corridor. This is not a universal answer, and corridor information is not globally deleted from Supply Lines. Two broad categories exist. **Self-directed methods** — a Skeleton Crew worker, a hypothetical bat or parrot carrier, a future aquatic carrier, other autonomous summoned workers — receive Source and Destination and answer for themselves how to get there, walking, flying or swimming as their movement vocabulary allows. **Intrinsically directional, path-authored methods** — rails, water channels and other physically directional transport — carry the corridor as part of the logistical method itself, because the construction already encodes movement direction and topology. Different methods may establish their connection differently; the system normalizes their output through Flow Weight and Item Rate rather than forcing identical topology. The 11 September player-authored corridor model remains canon for player-guided and path-authored methods and no longer applies to self-directed carriers.</w:t>
+        <w:t xml:space="preserve">Resolved, late September 2026. Source: [WR]. Endpoints are sufficient to express player intent **for self-directed logistical methods**, which therefore need no player-authored corridor. This is not a universal answer, and corridor information is not globally deleted from Supply Lines. Two broad categories exist. **Self-directed methods** — a Skeleton Crew worker, a hypothetical bat or parrot carrier, a future aquatic carrier, other autonomous summoned workers — receive Source and Destination and answer for themselves how to get there, walking, flying or swimming as their movement vocabulary allows. **Intrinsically directional, path-authored methods** — rails, water channels and other physically directional transport — carry the corridor as part of the logistical method itself, because the construction already encodes movement direction and topology. Different methods may establish their connection differently; the system normalizes their output through Capacity and Item Rate rather than forcing identical topology. The 11 September player-authored corridor model remains canon for player-guided and path-authored methods and no longer applies to self-directed carriers.</w:t>
       </w:r>
     </w:p>
     <w:p>
@@ -9259,7 +9259,7 @@
     </w:p>
     <w:p>
       <w:r>
-        <w:t>Direct inventory transfer is the current preferred execution model. Once a Supply Line has a source Copper Chest, a destination Copper Chest, a Flow Weight and an Item Rate, the recognized line periodically transfers up to Flow Weight eligible actual items from the source inventory into the destination inventory at the derived interval. The items are real, the inventories are real, the endpoints are physical and attackable, and the transfer is deterministic. This should be the first model prototyped.</w:t>
+        <w:t xml:space="preserve">Direct inventory transfer is the current preferred execution model. Once a Supply Line has a source Copper Chest, a destination Copper Chest, a Capacity and an Item Rate, the recognized line periodically transfers up to Capacity eligible cargo slots from the source inventory into the destination inventory at the derived interval. The items are real, the inventories are real, the endpoints are physical and attackable, and the transfer is deterministic. This should be the first model prototyped.</w:t>
       </w:r>
     </w:p>
     <w:p>
@@ -9287,12 +9287,12 @@
     </w:p>
     <w:p>
       <w:r>
-        <w:t>Working. Source: [WR]. A normal class ability should generally not say "create a Supply Line." Classes create unusual physical Minecraft behaviour, and the system recognizes that behaviour as infrastructure when appropriate. A Skeleton Crew ability knows "move cargo from this Source to this Destination"; it does not know "create Supply Line #4 with these Item Rate and Flow Weight values." The system independently knows that a logistical method has established a valid connection between infrastructure-eligible nodes, and when progression allows recognition it may recognize and simulate that behaviour as a Supply Line. Keep **class creates behaviour, then the system recognizes infrastructure**, violating the firewall only intentionally for a class whose exceptional fantasy is manipulating already-recognized infrastructure.</w:t>
-      </w:r>
-    </w:p>
-    <w:p>
-      <w:r>
-        <w:t>The Skeleton Crew consequence follows. Crew Members are self-directed logistical workers with an authored Flow Weight plus actual movement and pathfinding; a later upgrade producing a stronger worker need not say "+Supply Line Flow Weight" or "+Supply Line Item Rate," because greater cargo capacity, faster movement and better traversal produce those results naturally.</w:t>
+        <w:t xml:space="preserve">Working. Source: [WR]. A normal class ability should generally not say "create a Supply Line." Classes create unusual physical Minecraft behaviour, and the system recognizes that behaviour as infrastructure when appropriate. A Skeleton Crew ability knows "move cargo from this Source to this Destination"; it does not know "create Supply Line #4 with these Item Rate and Capacity values." The system independently knows that a logistical method has established a valid connection between infrastructure-eligible nodes, and when progression allows recognition it may recognize and simulate that behaviour as a Supply Line. Keep **class creates behaviour, then the system recognizes infrastructure**, violating the firewall only intentionally for a class whose exceptional fantasy is manipulating already-recognized infrastructure.</w:t>
+      </w:r>
+    </w:p>
+    <w:p>
+      <w:r>
+        <w:t xml:space="preserve">The Skeleton Crew consequence follows. Crew Members are self-directed logistical workers with a Capacity in inventory slots plus actual movement and pathfinding; a later upgrade producing a stronger worker need not say "+Supply Line Capacity" or "+Supply Line Item Rate," because greater cargo capacity, faster movement and better traversal produce those results naturally.</w:t>
       </w:r>
     </w:p>
     <w:p>
@@ -16088,7 +16088,7 @@
     </w:p>
     <w:p>
       <w:r>
-        <w:t>Buildable Scale and Operational Scale are distinct working progression dimensions. Operational Area defines legal infrastructure connection eligibility, not a general buff radius. Infrastructure Mode is the shared recognition interface; Transit Time and Flow Weight rate demonstrated logistical performance, with ordinary player Flow Weight 1. Extent/relation and constitutive/facilitative define the four infrastructure identities (§6.1.1). These working terms do not specify a final UI. Occupation, occupational, and sustainment efficiency refer to the unresolved intrinsic Construct benefit. Herds, Crop Patches, and Mob Swarms name unfinished world-population concepts; they do not carry a complete spawn or reward contract.</w:t>
+        <w:t xml:space="preserve">Buildable Scale and Operational Scale are distinct working progression dimensions. Operational Area defines legal infrastructure connection eligibility, not a general buff radius. Infrastructure Mode is the shared recognition interface; Transit Time and Capacity rate demonstrated logistical performance; Capacity supersedes Flow Weight and is measured in Minecraft inventory slots. Extent/relation and constitutive/facilitative define the four infrastructure identities (§6.1.1). These working terms do not specify a final UI. Occupation, occupational, and sustainment efficiency refer to the unresolved intrinsic Construct benefit. Herds, Crop Patches, and Mob Swarms name unfinished world-population concepts; they do not carry a complete spawn or reward contract.</w:t>
       </w:r>
     </w:p>
     <w:p>
@@ -16701,7 +16701,7 @@
     </w:p>
     <w:p>
       <w:r>
-        <w:t xml:space="preserve">[OPEN] Readiness dependencies added on 11 September: Structural Integrity strength and whether mining, explosions and abilities are affected differently; a narrow definition of infrastructure-relevant block; Structural Integrity behaviour when practical control changes; the exact input for authoring a logistical corridor; qualifying cargo movement; derivation of pulse interval from Transit Time; authored Flow Weight values and whether they vary by cargo, carrier or upgrade; branching and rerouting; permitted carrier deviation from the authored corridor; failure to resolve; obstruction after establishment; interaction with Routes; capture and re-establishment; whether engineered transport needs any balancing disadvantage; long-distance destination targeting; and datapack feasibility for entity navigation.</w:t>
+        <w:t xml:space="preserve">[OPEN] Readiness dependencies added on 11 September: Structural Integrity strength and whether mining, explosions and abilities are affected differently; a narrow definition of infrastructure-relevant block; Structural Integrity behaviour when practical control changes; the exact input for authoring a logistical corridor; qualifying cargo movement; derivation of pulse interval from Transit Time; Capacity values and whether they vary by cargo, carrier or upgrade; branching and rerouting; permitted carrier deviation from the authored corridor; failure to resolve; obstruction after establishment; interaction with Routes; capture and re-establishment; whether engineered transport needs any balancing disadvantage; long-distance destination targeting; and datapack feasibility for entity navigation.</w:t>
       </w:r>
     </w:p>
     <w:p>
@@ -18823,7 +18823,7 @@
     </w:p>
     <w:p>
       <w:r>
-        <w:t>Late September 2026: a WAMS infrastructure clarification handoff from the Skeleton Crew and Logistics discussion introduced the designation-and-evidence model, the place versus connection organizing frame, archetype-native anchors (Banners, Copper Chests, Construction Blocks, developable resources), Construct block-investment and extent evaluation, Development Weight with dynamic recalculation, the source-to-destination rule for self-directed logistical entities, the distinction between pre-infrastructure physical Logistics and recognized Supply Lines, and direct Copper Chest inventory transfer as the preferred execution model. Four tensions with 10 and 11 September canon were recorded as [CONFLICT] rather than resolved. A subsequent infrastructure reconciliation handoff [WR] then decided them: explicit Copper Chest Source designation is reinstated; Flow Weight belongs to the logistical method while Item Rate emerges from that method's actual movement over the connection, with player-authored Item Rate removed; endpoints suffice only for self-directed carriers, leaving corridors meaningful for path-authored methods; and the class-ability firewall is reaffirmed. Route corridor retention remains [OPEN].</w:t>
+        <w:t xml:space="preserve">Late September 2026: a WAMS infrastructure clarification handoff from the Skeleton Crew and Logistics discussion introduced the designation-and-evidence model, the place versus connection organizing frame, archetype-native anchors (Banners, Copper Chests, Construction Blocks, developable resources), Construct block-investment and extent evaluation, Development Weight with dynamic recalculation, the source-to-destination rule for self-directed logistical entities, the distinction between pre-infrastructure physical Logistics and recognized Supply Lines, and direct Copper Chest inventory transfer as the preferred execution model. Four tensions with 10 and 11 September canon were recorded as [CONFLICT] rather than resolved. A subsequent infrastructure reconciliation handoff [WR] then decided them: explicit Copper Chest Source designation is reinstated; Capacity belongs to the logistical method while Item Rate emerges from that method's actual movement over the connection, with player-authored Item Rate removed; endpoints suffice only for self-directed carriers, leaving corridors meaningful for path-authored methods; and the class-ability firewall is reaffirmed. Route corridor retention remains [OPEN].</w:t>
       </w:r>
     </w:p>
     <w:p>
@@ -21449,7 +21449,7 @@
     </w:p>
     <w:p>
       <w:r>
-        <w:t>[WR] Minecraft MOBA Infrastructure Reconciliation / Correction Handoff. September 2026. Resolves the four [WC]/[WB] conflicts, reinstates explicit Supply Line start, corrects Flow Weight and Item Rate authorship, splits self-directed from path-authored logistical methods, reaffirms the class-ability firewall, and states the shared start/journey/end connection grammar. Retains [WC] where it is not corrected; does not supersede [WB] wholesale. See docs/reconciliation/2026-09-11-infrastructure-reconciliation.md.</w:t>
+        <w:t xml:space="preserve">[WR] Minecraft MOBA Infrastructure Reconciliation / Correction Handoff. September 2026. Resolves the four [WC]/[WB] conflicts, reinstates explicit Supply Line start, corrects Capacity (then Flow Weight) and Item Rate authorship, splits self-directed from path-authored logistical methods, reaffirms the class-ability firewall, and states the shared start/journey/end connection grammar. Retains [WC] where it is not corrected; does not supersede [WB] wholesale. See docs/reconciliation/2026-09-11-infrastructure-reconciliation.md.</w:t>
       </w:r>
     </w:p>
     <w:p>

</xml_diff>